<commit_message>
Update main resume with dev
</commit_message>
<xml_diff>
--- a/Harshit_Jindal_SDE.docx
+++ b/Harshit_Jindal_SDE.docx
@@ -71,22 +71,6 @@
               </w:rPr>
               <w:t>Software Engineer</w:t>
             </w:r>
-            <w:r>
-              <w:rPr>
-                <w:rFonts w:ascii="Calibri" w:hAnsi="Calibri" w:cs="Calibri"/>
-                <w:sz w:val="20"/>
-                <w:szCs w:val="20"/>
-              </w:rPr>
-              <w:t xml:space="preserve"> </w:t>
-            </w:r>
-            <w:r>
-              <w:rPr>
-                <w:rFonts w:ascii="Calibri" w:hAnsi="Calibri" w:cs="Calibri"/>
-                <w:sz w:val="20"/>
-                <w:szCs w:val="20"/>
-              </w:rPr>
-              <w:t>| 2 YOE</w:t>
-            </w:r>
           </w:p>
         </w:tc>
       </w:tr>
@@ -395,7 +379,7 @@
                 <w:sz w:val="20"/>
                 <w:szCs w:val="20"/>
               </w:rPr>
-              <w:t>S</w:t>
+              <w:t>Backend s</w:t>
             </w:r>
             <w:r>
               <w:rPr>
@@ -420,7 +404,7 @@
                 <w:sz w:val="20"/>
                 <w:szCs w:val="20"/>
               </w:rPr>
-              <w:t>working on</w:t>
+              <w:t>for</w:t>
             </w:r>
             <w:r>
               <w:rPr>
@@ -436,7 +420,15 @@
                 <w:sz w:val="20"/>
                 <w:szCs w:val="20"/>
               </w:rPr>
-              <w:t xml:space="preserve">the </w:t>
+              <w:t>a critical</w:t>
+            </w:r>
+            <w:r>
+              <w:rPr>
+                <w:rFonts w:ascii="Calibri" w:hAnsi="Calibri" w:cs="Calibri"/>
+                <w:sz w:val="20"/>
+                <w:szCs w:val="20"/>
+              </w:rPr>
+              <w:t xml:space="preserve"> </w:t>
             </w:r>
             <w:r>
               <w:rPr>
@@ -476,15 +468,7 @@
                 <w:sz w:val="20"/>
                 <w:szCs w:val="20"/>
               </w:rPr>
-              <w:t xml:space="preserve">that </w:t>
-            </w:r>
-            <w:r>
-              <w:rPr>
-                <w:rFonts w:ascii="Calibri" w:hAnsi="Calibri" w:cs="Calibri"/>
-                <w:sz w:val="20"/>
-                <w:szCs w:val="20"/>
-              </w:rPr>
-              <w:t>facilitates</w:t>
+              <w:t>used by data scientists for</w:t>
             </w:r>
             <w:r>
               <w:rPr>
@@ -533,14 +517,6 @@
                 <w:szCs w:val="20"/>
               </w:rPr>
               <w:t xml:space="preserve"> and deployment of Machine Learning (ML) models at Amex.</w:t>
-            </w:r>
-            <w:r>
-              <w:rPr>
-                <w:rFonts w:ascii="Calibri" w:hAnsi="Calibri" w:cs="Calibri"/>
-                <w:sz w:val="20"/>
-                <w:szCs w:val="20"/>
-              </w:rPr>
-              <w:t xml:space="preserve"> </w:t>
             </w:r>
           </w:p>
           <w:p>
@@ -570,15 +546,39 @@
                 <w:sz w:val="20"/>
                 <w:szCs w:val="20"/>
               </w:rPr>
-              <w:t>B</w:t>
-            </w:r>
-            <w:r>
-              <w:rPr>
-                <w:rFonts w:ascii="Calibri" w:hAnsi="Calibri" w:cs="Calibri"/>
-                <w:sz w:val="20"/>
-                <w:szCs w:val="20"/>
-              </w:rPr>
-              <w:t>uilt</w:t>
+              <w:t>Led</w:t>
+            </w:r>
+            <w:r>
+              <w:rPr>
+                <w:rFonts w:ascii="Calibri" w:hAnsi="Calibri" w:cs="Calibri"/>
+                <w:sz w:val="20"/>
+                <w:szCs w:val="20"/>
+              </w:rPr>
+              <w:t xml:space="preserve"> a team</w:t>
+            </w:r>
+            <w:r>
+              <w:rPr>
+                <w:rFonts w:ascii="Calibri" w:hAnsi="Calibri" w:cs="Calibri"/>
+                <w:sz w:val="20"/>
+                <w:szCs w:val="20"/>
+              </w:rPr>
+              <w:t xml:space="preserve"> of four</w:t>
+            </w:r>
+            <w:r>
+              <w:rPr>
+                <w:rFonts w:ascii="Calibri" w:hAnsi="Calibri" w:cs="Calibri"/>
+                <w:sz w:val="20"/>
+                <w:szCs w:val="20"/>
+              </w:rPr>
+              <w:t xml:space="preserve"> to build</w:t>
+            </w:r>
+            <w:r>
+              <w:rPr>
+                <w:rFonts w:ascii="Calibri" w:hAnsi="Calibri" w:cs="Calibri"/>
+                <w:sz w:val="20"/>
+                <w:szCs w:val="20"/>
+              </w:rPr>
+              <w:t xml:space="preserve"> and own</w:t>
             </w:r>
             <w:r>
               <w:rPr>
@@ -594,14 +594,6 @@
                 <w:sz w:val="20"/>
                 <w:szCs w:val="20"/>
               </w:rPr>
-              <w:t xml:space="preserve">and took ownership of </w:t>
-            </w:r>
-            <w:r>
-              <w:rPr>
-                <w:rFonts w:ascii="Calibri" w:hAnsi="Calibri" w:cs="Calibri"/>
-                <w:sz w:val="20"/>
-                <w:szCs w:val="20"/>
-              </w:rPr>
               <w:t xml:space="preserve">a </w:t>
             </w:r>
             <w:r>
@@ -738,7 +730,7 @@
                 <w:sz w:val="20"/>
                 <w:szCs w:val="20"/>
               </w:rPr>
-              <w:t>pre-tax income (PTI) benefit of over $50 million in 2023.</w:t>
+              <w:t>pre-tax income benefit of over $50 million in 2023.</w:t>
             </w:r>
           </w:p>
           <w:p>
@@ -766,7 +758,23 @@
                 <w:sz w:val="20"/>
                 <w:szCs w:val="20"/>
               </w:rPr>
-              <w:t>Led the tech revamp for the</w:t>
+              <w:t>R</w:t>
+            </w:r>
+            <w:r>
+              <w:rPr>
+                <w:rFonts w:ascii="Calibri" w:hAnsi="Calibri" w:cs="Calibri"/>
+                <w:sz w:val="20"/>
+                <w:szCs w:val="20"/>
+              </w:rPr>
+              <w:t>efactor</w:t>
+            </w:r>
+            <w:r>
+              <w:rPr>
+                <w:rFonts w:ascii="Calibri" w:hAnsi="Calibri" w:cs="Calibri"/>
+                <w:sz w:val="20"/>
+                <w:szCs w:val="20"/>
+              </w:rPr>
+              <w:t>ed</w:t>
             </w:r>
             <w:r>
               <w:rPr>
@@ -782,31 +790,143 @@
                 <w:sz w:val="20"/>
                 <w:szCs w:val="20"/>
               </w:rPr>
-              <w:t>application’s</w:t>
-            </w:r>
-            <w:r>
-              <w:rPr>
-                <w:rFonts w:ascii="Calibri" w:hAnsi="Calibri" w:cs="Calibri"/>
-                <w:sz w:val="20"/>
-                <w:szCs w:val="20"/>
-              </w:rPr>
-              <w:t xml:space="preserve"> monolithic codebase to service-oriented architecture </w:t>
-            </w:r>
-            <w:r>
-              <w:rPr>
-                <w:rFonts w:ascii="Calibri" w:hAnsi="Calibri" w:cs="Calibri"/>
-                <w:sz w:val="20"/>
-                <w:szCs w:val="20"/>
-              </w:rPr>
-              <w:t xml:space="preserve">for better </w:t>
-            </w:r>
-            <w:r>
-              <w:rPr>
-                <w:rFonts w:ascii="Calibri" w:hAnsi="Calibri" w:cs="Calibri"/>
-                <w:sz w:val="20"/>
-                <w:szCs w:val="20"/>
-              </w:rPr>
-              <w:t>maintainability.</w:t>
+              <w:t>the</w:t>
+            </w:r>
+            <w:r>
+              <w:rPr>
+                <w:rFonts w:ascii="Calibri" w:hAnsi="Calibri" w:cs="Calibri"/>
+                <w:sz w:val="20"/>
+                <w:szCs w:val="20"/>
+              </w:rPr>
+              <w:t xml:space="preserve"> </w:t>
+            </w:r>
+            <w:r>
+              <w:rPr>
+                <w:rFonts w:ascii="Calibri" w:hAnsi="Calibri" w:cs="Calibri"/>
+                <w:sz w:val="20"/>
+                <w:szCs w:val="20"/>
+              </w:rPr>
+              <w:t>monolith</w:t>
+            </w:r>
+            <w:r>
+              <w:rPr>
+                <w:rFonts w:ascii="Calibri" w:hAnsi="Calibri" w:cs="Calibri"/>
+                <w:sz w:val="20"/>
+                <w:szCs w:val="20"/>
+              </w:rPr>
+              <w:t>ic</w:t>
+            </w:r>
+            <w:r>
+              <w:rPr>
+                <w:rFonts w:ascii="Calibri" w:hAnsi="Calibri" w:cs="Calibri"/>
+                <w:sz w:val="20"/>
+                <w:szCs w:val="20"/>
+              </w:rPr>
+              <w:t xml:space="preserve"> app</w:t>
+            </w:r>
+            <w:r>
+              <w:rPr>
+                <w:rFonts w:ascii="Calibri" w:hAnsi="Calibri" w:cs="Calibri"/>
+                <w:sz w:val="20"/>
+                <w:szCs w:val="20"/>
+              </w:rPr>
+              <w:t>lication</w:t>
+            </w:r>
+            <w:r>
+              <w:rPr>
+                <w:rFonts w:ascii="Calibri" w:hAnsi="Calibri" w:cs="Calibri"/>
+                <w:sz w:val="20"/>
+                <w:szCs w:val="20"/>
+              </w:rPr>
+              <w:t xml:space="preserve"> </w:t>
+            </w:r>
+            <w:r>
+              <w:rPr>
+                <w:rFonts w:ascii="Calibri" w:hAnsi="Calibri" w:cs="Calibri"/>
+                <w:sz w:val="20"/>
+                <w:szCs w:val="20"/>
+              </w:rPr>
+              <w:t>into</w:t>
+            </w:r>
+            <w:r>
+              <w:rPr>
+                <w:rFonts w:ascii="Calibri" w:hAnsi="Calibri" w:cs="Calibri"/>
+                <w:sz w:val="20"/>
+                <w:szCs w:val="20"/>
+              </w:rPr>
+              <w:t xml:space="preserve"> individual services</w:t>
+            </w:r>
+            <w:r>
+              <w:rPr>
+                <w:rFonts w:ascii="Calibri" w:hAnsi="Calibri" w:cs="Calibri"/>
+                <w:sz w:val="20"/>
+                <w:szCs w:val="20"/>
+              </w:rPr>
+              <w:t xml:space="preserve">, </w:t>
+            </w:r>
+            <w:r>
+              <w:rPr>
+                <w:rFonts w:ascii="Calibri" w:hAnsi="Calibri" w:cs="Calibri"/>
+                <w:sz w:val="20"/>
+                <w:szCs w:val="20"/>
+              </w:rPr>
+              <w:t>reduc</w:t>
+            </w:r>
+            <w:r>
+              <w:rPr>
+                <w:rFonts w:ascii="Calibri" w:hAnsi="Calibri" w:cs="Calibri"/>
+                <w:sz w:val="20"/>
+                <w:szCs w:val="20"/>
+              </w:rPr>
+              <w:t>ing</w:t>
+            </w:r>
+            <w:r>
+              <w:rPr>
+                <w:rFonts w:ascii="Calibri" w:hAnsi="Calibri" w:cs="Calibri"/>
+                <w:sz w:val="20"/>
+                <w:szCs w:val="20"/>
+              </w:rPr>
+              <w:t xml:space="preserve"> code complexity</w:t>
+            </w:r>
+            <w:r>
+              <w:rPr>
+                <w:rFonts w:ascii="Calibri" w:hAnsi="Calibri" w:cs="Calibri"/>
+                <w:sz w:val="20"/>
+                <w:szCs w:val="20"/>
+              </w:rPr>
+              <w:t xml:space="preserve"> and </w:t>
+            </w:r>
+            <w:r>
+              <w:rPr>
+                <w:rFonts w:ascii="Calibri" w:hAnsi="Calibri" w:cs="Calibri"/>
+                <w:sz w:val="20"/>
+                <w:szCs w:val="20"/>
+              </w:rPr>
+              <w:t>improv</w:t>
+            </w:r>
+            <w:r>
+              <w:rPr>
+                <w:rFonts w:ascii="Calibri" w:hAnsi="Calibri" w:cs="Calibri"/>
+                <w:sz w:val="20"/>
+                <w:szCs w:val="20"/>
+              </w:rPr>
+              <w:t xml:space="preserve">ing </w:t>
+            </w:r>
+            <w:r>
+              <w:rPr>
+                <w:rFonts w:ascii="Calibri" w:hAnsi="Calibri" w:cs="Calibri"/>
+                <w:sz w:val="20"/>
+                <w:szCs w:val="20"/>
+              </w:rPr>
+              <w:t>maintainability</w:t>
+            </w:r>
+            <w:r>
+              <w:rPr>
+                <w:rFonts w:ascii="Calibri" w:hAnsi="Calibri" w:cs="Calibri"/>
+                <w:sz w:val="20"/>
+                <w:szCs w:val="20"/>
+              </w:rPr>
+              <w:t>.</w:t>
             </w:r>
           </w:p>
           <w:bookmarkEnd w:id="7"/>
@@ -908,15 +1028,31 @@
                 <w:sz w:val="20"/>
                 <w:szCs w:val="20"/>
               </w:rPr>
-              <w:t>Managed a team of seven colleagues</w:t>
-            </w:r>
-            <w:r>
-              <w:rPr>
-                <w:rFonts w:ascii="Calibri" w:hAnsi="Calibri" w:cs="Calibri"/>
-                <w:sz w:val="20"/>
-                <w:szCs w:val="20"/>
-              </w:rPr>
-              <w:t xml:space="preserve"> to build </w:t>
+              <w:t>Mentored</w:t>
+            </w:r>
+            <w:r>
+              <w:rPr>
+                <w:rFonts w:ascii="Calibri" w:hAnsi="Calibri" w:cs="Calibri"/>
+                <w:sz w:val="20"/>
+                <w:szCs w:val="20"/>
+              </w:rPr>
+              <w:t xml:space="preserve"> seven colleagues</w:t>
+            </w:r>
+            <w:r>
+              <w:rPr>
+                <w:rFonts w:ascii="Calibri" w:hAnsi="Calibri" w:cs="Calibri"/>
+                <w:sz w:val="20"/>
+                <w:szCs w:val="20"/>
+              </w:rPr>
+              <w:t xml:space="preserve"> </w:t>
+            </w:r>
+            <w:r>
+              <w:rPr>
+                <w:rFonts w:ascii="Calibri" w:hAnsi="Calibri" w:cs="Calibri"/>
+                <w:sz w:val="20"/>
+                <w:szCs w:val="20"/>
+              </w:rPr>
+              <w:t xml:space="preserve">to build </w:t>
             </w:r>
             <w:r>
               <w:rPr>
@@ -956,7 +1092,39 @@
                 <w:sz w:val="20"/>
                 <w:szCs w:val="20"/>
               </w:rPr>
-              <w:t>, aiding the Decision Science teams in developing and upgrading the ML models more efficiently.</w:t>
+              <w:t xml:space="preserve">, aiding the </w:t>
+            </w:r>
+            <w:r>
+              <w:rPr>
+                <w:rFonts w:ascii="Calibri" w:hAnsi="Calibri" w:cs="Calibri"/>
+                <w:sz w:val="20"/>
+                <w:szCs w:val="20"/>
+              </w:rPr>
+              <w:t>d</w:t>
+            </w:r>
+            <w:r>
+              <w:rPr>
+                <w:rFonts w:ascii="Calibri" w:hAnsi="Calibri" w:cs="Calibri"/>
+                <w:sz w:val="20"/>
+                <w:szCs w:val="20"/>
+              </w:rPr>
+              <w:t xml:space="preserve">ecision </w:t>
+            </w:r>
+            <w:r>
+              <w:rPr>
+                <w:rFonts w:ascii="Calibri" w:hAnsi="Calibri" w:cs="Calibri"/>
+                <w:sz w:val="20"/>
+                <w:szCs w:val="20"/>
+              </w:rPr>
+              <w:t>s</w:t>
+            </w:r>
+            <w:r>
+              <w:rPr>
+                <w:rFonts w:ascii="Calibri" w:hAnsi="Calibri" w:cs="Calibri"/>
+                <w:sz w:val="20"/>
+                <w:szCs w:val="20"/>
+              </w:rPr>
+              <w:t>cience teams in developing and upgrading the ML models more efficiently.</w:t>
             </w:r>
             <w:r>
               <w:rPr>
@@ -1110,6 +1278,28 @@
                 <w:szCs w:val="20"/>
               </w:rPr>
               <w:t>Intern</w:t>
+            </w:r>
+            <w:r>
+              <w:rPr>
+                <w:rFonts w:ascii="Calibri" w:hAnsi="Calibri" w:cs="Calibri"/>
+                <w:b/>
+                <w:i/>
+                <w:iCs/>
+                <w:sz w:val="20"/>
+                <w:szCs w:val="20"/>
+              </w:rPr>
+              <w:t xml:space="preserve">, Product </w:t>
+            </w:r>
+            <w:r>
+              <w:rPr>
+                <w:rFonts w:ascii="Calibri" w:hAnsi="Calibri" w:cs="Calibri"/>
+                <w:b/>
+                <w:i/>
+                <w:iCs/>
+                <w:sz w:val="20"/>
+                <w:szCs w:val="20"/>
+              </w:rPr>
+              <w:t>Development</w:t>
             </w:r>
           </w:p>
         </w:tc>
@@ -1205,7 +1395,23 @@
                 <w:sz w:val="20"/>
                 <w:szCs w:val="20"/>
               </w:rPr>
-              <w:t>Programmed six manual processes into end-to-end automated pipelines using Selenium, Pandas, Requests, and Flask.</w:t>
+              <w:t>Programmed six manual processes into end-to-end automated pipelines using Selenium</w:t>
+            </w:r>
+            <w:r>
+              <w:rPr>
+                <w:rFonts w:ascii="Calibri" w:hAnsi="Calibri" w:cs="Calibri"/>
+                <w:sz w:val="20"/>
+                <w:szCs w:val="20"/>
+              </w:rPr>
+              <w:t xml:space="preserve"> and the Pandas library</w:t>
+            </w:r>
+            <w:r>
+              <w:rPr>
+                <w:rFonts w:ascii="Calibri" w:hAnsi="Calibri" w:cs="Calibri"/>
+                <w:sz w:val="20"/>
+                <w:szCs w:val="20"/>
+              </w:rPr>
+              <w:t>.</w:t>
             </w:r>
           </w:p>
           <w:bookmarkEnd w:id="10"/>
@@ -1232,7 +1438,39 @@
                 <w:sz w:val="20"/>
                 <w:szCs w:val="20"/>
               </w:rPr>
-              <w:t>Coded 100+ rules for the Dynamic Authorization of Credit (DAC) system that utilize scores from in-house ML models to take the final decisions.</w:t>
+              <w:t>Coded 100+ rules for the Dynamic Authorization system</w:t>
+            </w:r>
+            <w:r>
+              <w:rPr>
+                <w:rFonts w:ascii="Calibri" w:hAnsi="Calibri" w:cs="Calibri"/>
+                <w:sz w:val="20"/>
+                <w:szCs w:val="20"/>
+              </w:rPr>
+              <w:t xml:space="preserve"> responsible for </w:t>
+            </w:r>
+            <w:r>
+              <w:rPr>
+                <w:rFonts w:ascii="Calibri" w:hAnsi="Calibri" w:cs="Calibri"/>
+                <w:sz w:val="20"/>
+                <w:szCs w:val="20"/>
+              </w:rPr>
+              <w:t xml:space="preserve">the </w:t>
+            </w:r>
+            <w:r>
+              <w:rPr>
+                <w:rFonts w:ascii="Calibri" w:hAnsi="Calibri" w:cs="Calibri"/>
+                <w:sz w:val="20"/>
+                <w:szCs w:val="20"/>
+              </w:rPr>
+              <w:t>credit and fraud decisioning</w:t>
+            </w:r>
+            <w:r>
+              <w:rPr>
+                <w:rFonts w:ascii="Calibri" w:hAnsi="Calibri" w:cs="Calibri"/>
+                <w:sz w:val="20"/>
+                <w:szCs w:val="20"/>
+              </w:rPr>
+              <w:t xml:space="preserve"> basis ML scores.</w:t>
             </w:r>
           </w:p>
           <w:p>
@@ -1278,7 +1516,7 @@
                 <w:sz w:val="20"/>
                 <w:szCs w:val="20"/>
               </w:rPr>
-              <w:t>iOS Develop</w:t>
+              <w:t>Intern, iOS</w:t>
             </w:r>
             <w:r>
               <w:rPr>
@@ -1289,7 +1527,7 @@
                 <w:sz w:val="20"/>
                 <w:szCs w:val="20"/>
               </w:rPr>
-              <w:t xml:space="preserve">ment </w:t>
+              <w:t xml:space="preserve"> Develop</w:t>
             </w:r>
             <w:r>
               <w:rPr>
@@ -1300,7 +1538,7 @@
                 <w:sz w:val="20"/>
                 <w:szCs w:val="20"/>
               </w:rPr>
-              <w:t>Intern</w:t>
+              <w:t>ment</w:t>
             </w:r>
           </w:p>
         </w:tc>
@@ -1406,7 +1644,23 @@
                 <w:sz w:val="20"/>
                 <w:szCs w:val="20"/>
               </w:rPr>
-              <w:t xml:space="preserve">Augmented Reality Home Planner: Used Apple ARKit to develop an </w:t>
+              <w:t xml:space="preserve">Augmented Reality Home Planner: Used Apple ARKit to </w:t>
+            </w:r>
+            <w:r>
+              <w:rPr>
+                <w:rFonts w:ascii="Calibri" w:hAnsi="Calibri" w:cs="Calibri"/>
+                <w:sz w:val="20"/>
+                <w:szCs w:val="20"/>
+              </w:rPr>
+              <w:t>assist in the development</w:t>
+            </w:r>
+            <w:r>
+              <w:rPr>
+                <w:rFonts w:ascii="Calibri" w:hAnsi="Calibri" w:cs="Calibri"/>
+                <w:sz w:val="20"/>
+                <w:szCs w:val="20"/>
+              </w:rPr>
+              <w:t xml:space="preserve"> an </w:t>
             </w:r>
             <w:r>
               <w:rPr>
@@ -1752,7 +2006,141 @@
               </w:rPr>
               <w:t>2/10</w:t>
             </w:r>
+            <w:bookmarkStart w:id="11" w:name="_Hlk158931231"/>
+            <w:r>
+              <w:rPr>
+                <w:rFonts w:ascii="Calibri" w:hAnsi="Calibri" w:cs="Calibri"/>
+                <w:sz w:val="20"/>
+                <w:szCs w:val="20"/>
+              </w:rPr>
+              <w:t xml:space="preserve"> (work-integrated)</w:t>
+            </w:r>
+            <w:r>
+              <w:rPr>
+                <w:rFonts w:ascii="Calibri" w:hAnsi="Calibri" w:cs="Calibri"/>
+                <w:sz w:val="20"/>
+                <w:szCs w:val="20"/>
+              </w:rPr>
+              <w:t>.</w:t>
+            </w:r>
           </w:p>
+          <w:p>
+            <w:pPr>
+              <w:numPr>
+                <w:ilvl w:val="0"/>
+                <w:numId w:val="5"/>
+              </w:numPr>
+              <w:tabs>
+                <w:tab w:val="clear" w:pos="720"/>
+              </w:tabs>
+              <w:ind w:left="252" w:hanging="180"/>
+              <w:rPr>
+                <w:rFonts w:ascii="Calibri" w:hAnsi="Calibri" w:cs="Calibri"/>
+                <w:sz w:val="20"/>
+                <w:szCs w:val="20"/>
+              </w:rPr>
+            </w:pPr>
+            <w:r>
+              <w:rPr>
+                <w:rFonts w:ascii="Calibri" w:hAnsi="Calibri" w:cs="Calibri"/>
+                <w:sz w:val="20"/>
+                <w:szCs w:val="20"/>
+              </w:rPr>
+              <w:t xml:space="preserve">Coursework: Software Architecture, </w:t>
+            </w:r>
+            <w:r>
+              <w:rPr>
+                <w:rFonts w:ascii="Calibri" w:hAnsi="Calibri" w:cs="Calibri"/>
+                <w:sz w:val="20"/>
+                <w:szCs w:val="20"/>
+              </w:rPr>
+              <w:t>Service</w:t>
+            </w:r>
+            <w:r>
+              <w:rPr>
+                <w:rFonts w:ascii="Calibri" w:hAnsi="Calibri" w:cs="Calibri"/>
+                <w:sz w:val="20"/>
+                <w:szCs w:val="20"/>
+              </w:rPr>
+              <w:t xml:space="preserve"> </w:t>
+            </w:r>
+            <w:r>
+              <w:rPr>
+                <w:rFonts w:ascii="Calibri" w:hAnsi="Calibri" w:cs="Calibri"/>
+                <w:sz w:val="20"/>
+                <w:szCs w:val="20"/>
+              </w:rPr>
+              <w:t xml:space="preserve">Oriented Computing, Cloud Computing, </w:t>
+            </w:r>
+            <w:r>
+              <w:rPr>
+                <w:rFonts w:ascii="Calibri" w:hAnsi="Calibri" w:cs="Calibri"/>
+                <w:sz w:val="20"/>
+                <w:szCs w:val="20"/>
+              </w:rPr>
+              <w:t xml:space="preserve">DevOps, </w:t>
+            </w:r>
+            <w:r>
+              <w:rPr>
+                <w:rFonts w:ascii="Calibri" w:hAnsi="Calibri" w:cs="Calibri"/>
+                <w:sz w:val="20"/>
+                <w:szCs w:val="20"/>
+              </w:rPr>
+              <w:t>Secure Software Engineering,</w:t>
+            </w:r>
+            <w:r>
+              <w:rPr>
+                <w:rFonts w:ascii="Calibri" w:hAnsi="Calibri" w:cs="Calibri"/>
+                <w:sz w:val="20"/>
+                <w:szCs w:val="20"/>
+              </w:rPr>
+              <w:t xml:space="preserve"> </w:t>
+            </w:r>
+            <w:r>
+              <w:rPr>
+                <w:rFonts w:ascii="Calibri" w:hAnsi="Calibri" w:cs="Calibri"/>
+                <w:sz w:val="20"/>
+                <w:szCs w:val="20"/>
+              </w:rPr>
+              <w:t xml:space="preserve">Software Testing Methodologies, </w:t>
+            </w:r>
+            <w:r>
+              <w:rPr>
+                <w:rFonts w:ascii="Calibri" w:hAnsi="Calibri" w:cs="Calibri"/>
+                <w:sz w:val="20"/>
+                <w:szCs w:val="20"/>
+              </w:rPr>
+              <w:t>Agile Software Processes, Software Product Management</w:t>
+            </w:r>
+            <w:r>
+              <w:rPr>
+                <w:rFonts w:ascii="Calibri" w:hAnsi="Calibri" w:cs="Calibri"/>
+                <w:sz w:val="20"/>
+                <w:szCs w:val="20"/>
+              </w:rPr>
+              <w:t xml:space="preserve">. Grade sheets available </w:t>
+            </w:r>
+            <w:hyperlink r:id="rId8" w:history="1">
+              <w:r>
+                <w:rPr>
+                  <w:rStyle w:val="Hyperlink"/>
+                  <w:rFonts w:ascii="Calibri" w:hAnsi="Calibri" w:cs="Calibri"/>
+                  <w:sz w:val="20"/>
+                  <w:szCs w:val="20"/>
+                </w:rPr>
+                <w:t>here</w:t>
+              </w:r>
+            </w:hyperlink>
+            <w:r>
+              <w:rPr>
+                <w:rFonts w:ascii="Calibri" w:hAnsi="Calibri" w:cs="Calibri"/>
+                <w:sz w:val="20"/>
+                <w:szCs w:val="20"/>
+              </w:rPr>
+              <w:t>.</w:t>
+            </w:r>
+          </w:p>
+          <w:bookmarkEnd w:id="11"/>
           <w:p>
             <w:pPr>
               <w:ind w:left="252"/>
@@ -1898,7 +2286,7 @@
                 <w:szCs w:val="20"/>
               </w:rPr>
             </w:pPr>
-            <w:bookmarkStart w:id="11" w:name="_Hlk144192934"/>
+            <w:bookmarkStart w:id="12" w:name="_Hlk144192934"/>
             <w:r>
               <w:rPr>
                 <w:rFonts w:ascii="Calibri" w:hAnsi="Calibri" w:cs="Calibri"/>
@@ -1947,8 +2335,16 @@
               </w:rPr>
               <w:t xml:space="preserve"> (with Honors)</w:t>
             </w:r>
+            <w:r>
+              <w:rPr>
+                <w:rFonts w:ascii="Calibri" w:hAnsi="Calibri" w:cs="Calibri"/>
+                <w:sz w:val="20"/>
+                <w:szCs w:val="20"/>
+              </w:rPr>
+              <w:t>.</w:t>
+            </w:r>
           </w:p>
-          <w:bookmarkEnd w:id="11"/>
+          <w:bookmarkEnd w:id="12"/>
           <w:p>
             <w:pPr>
               <w:ind w:left="252"/>
@@ -2022,43 +2418,43 @@
               <w:pStyle w:val="Achievement"/>
               <w:rPr>
                 <w:rFonts w:ascii="Calibri" w:hAnsi="Calibri" w:cs="Calibri"/>
+                <w:lang w:val="en-IN"/>
               </w:rPr>
             </w:pPr>
             <w:r>
               <w:rPr>
                 <w:rFonts w:ascii="Calibri" w:hAnsi="Calibri" w:cs="Calibri"/>
-              </w:rPr>
-              <w:t xml:space="preserve">Languages: </w:t>
-            </w:r>
-            <w:r>
-              <w:rPr>
-                <w:rFonts w:ascii="Calibri" w:hAnsi="Calibri" w:cs="Calibri"/>
-              </w:rPr>
-              <w:t>C++</w:t>
-            </w:r>
-            <w:r>
-              <w:rPr>
-                <w:rFonts w:ascii="Calibri" w:hAnsi="Calibri" w:cs="Calibri"/>
-              </w:rPr>
-              <w:t xml:space="preserve">, </w:t>
-            </w:r>
-            <w:r>
-              <w:rPr>
-                <w:rFonts w:ascii="Calibri" w:hAnsi="Calibri" w:cs="Calibri"/>
-              </w:rPr>
-              <w:t xml:space="preserve">Python, Swift, </w:t>
-            </w:r>
-            <w:r>
-              <w:rPr>
-                <w:rFonts w:ascii="Calibri" w:hAnsi="Calibri" w:cs="Calibri"/>
-              </w:rPr>
-              <w:t xml:space="preserve">Java, </w:t>
-            </w:r>
-            <w:r>
-              <w:rPr>
-                <w:rFonts w:ascii="Calibri" w:hAnsi="Calibri" w:cs="Calibri"/>
-              </w:rPr>
-              <w:t>Bash, SQL, Hive</w:t>
+                <w:lang w:val="en-IN"/>
+              </w:rPr>
+              <w:t xml:space="preserve">Proficient in </w:t>
+            </w:r>
+            <w:r>
+              <w:rPr>
+                <w:rFonts w:ascii="Calibri" w:hAnsi="Calibri" w:cs="Calibri"/>
+                <w:lang w:val="en-IN"/>
+              </w:rPr>
+              <w:t xml:space="preserve">Python (work experience), C++ (data structures &amp; algorithms), </w:t>
+            </w:r>
+            <w:r>
+              <w:rPr>
+                <w:rFonts w:ascii="Calibri" w:hAnsi="Calibri" w:cs="Calibri"/>
+                <w:lang w:val="en-IN"/>
+              </w:rPr>
+              <w:t xml:space="preserve">and </w:t>
+            </w:r>
+            <w:r>
+              <w:rPr>
+                <w:rFonts w:ascii="Calibri" w:hAnsi="Calibri" w:cs="Calibri"/>
+                <w:lang w:val="en-IN"/>
+              </w:rPr>
+              <w:t>Swift (internship)</w:t>
+            </w:r>
+            <w:r>
+              <w:rPr>
+                <w:rFonts w:ascii="Calibri" w:hAnsi="Calibri" w:cs="Calibri"/>
+                <w:lang w:val="en-IN"/>
+              </w:rPr>
+              <w:t>.</w:t>
             </w:r>
           </w:p>
           <w:p>
@@ -2066,81 +2462,197 @@
               <w:pStyle w:val="Achievement"/>
               <w:rPr>
                 <w:rFonts w:ascii="Calibri" w:hAnsi="Calibri" w:cs="Calibri"/>
+                <w:lang w:val="en-IN"/>
               </w:rPr>
             </w:pPr>
             <w:r>
               <w:rPr>
                 <w:rFonts w:ascii="Calibri" w:hAnsi="Calibri" w:cs="Calibri"/>
-              </w:rPr>
-              <w:t xml:space="preserve">Tools: </w:t>
-            </w:r>
-            <w:r>
-              <w:rPr>
-                <w:rFonts w:ascii="Calibri" w:hAnsi="Calibri" w:cs="Calibri"/>
-              </w:rPr>
-              <w:t>Git</w:t>
-            </w:r>
-            <w:r>
-              <w:rPr>
-                <w:rFonts w:ascii="Calibri" w:hAnsi="Calibri" w:cs="Calibri"/>
-              </w:rPr>
-              <w:t xml:space="preserve"> CLI</w:t>
-            </w:r>
-            <w:r>
-              <w:rPr>
-                <w:rFonts w:ascii="Calibri" w:hAnsi="Calibri" w:cs="Calibri"/>
+                <w:lang w:val="en-IN"/>
+              </w:rPr>
+              <w:t>Strong hold over</w:t>
+            </w:r>
+            <w:r>
+              <w:rPr>
+                <w:rFonts w:ascii="Calibri" w:hAnsi="Calibri" w:cs="Calibri"/>
+                <w:lang w:val="en-IN"/>
+              </w:rPr>
+              <w:t xml:space="preserve"> Linux CLI, </w:t>
+            </w:r>
+            <w:r>
+              <w:rPr>
+                <w:rFonts w:ascii="Calibri" w:hAnsi="Calibri" w:cs="Calibri"/>
+                <w:lang w:val="en-IN"/>
+              </w:rPr>
+              <w:t xml:space="preserve">Bash scripting, </w:t>
+            </w:r>
+            <w:r>
+              <w:rPr>
+                <w:rFonts w:ascii="Calibri" w:hAnsi="Calibri" w:cs="Calibri"/>
+                <w:lang w:val="en-IN"/>
+              </w:rPr>
+              <w:t>Git CLI</w:t>
+            </w:r>
+            <w:r>
+              <w:rPr>
+                <w:rFonts w:ascii="Calibri" w:hAnsi="Calibri" w:cs="Calibri"/>
+                <w:lang w:val="en-IN"/>
+              </w:rPr>
+              <w:t xml:space="preserve"> </w:t>
+            </w:r>
+            <w:r>
+              <w:rPr>
+                <w:rFonts w:ascii="Calibri" w:hAnsi="Calibri" w:cs="Calibri"/>
+                <w:lang w:val="en-IN"/>
+              </w:rPr>
+              <w:t>/</w:t>
+            </w:r>
+            <w:r>
+              <w:rPr>
+                <w:rFonts w:ascii="Calibri" w:hAnsi="Calibri" w:cs="Calibri"/>
+                <w:lang w:val="en-IN"/>
+              </w:rPr>
+              <w:t xml:space="preserve"> </w:t>
+            </w:r>
+            <w:r>
+              <w:rPr>
+                <w:rFonts w:ascii="Calibri" w:hAnsi="Calibri" w:cs="Calibri"/>
+                <w:lang w:val="en-IN"/>
+              </w:rPr>
+              <w:t>GitHub</w:t>
+            </w:r>
+            <w:r>
+              <w:rPr>
+                <w:rFonts w:ascii="Calibri" w:hAnsi="Calibri" w:cs="Calibri"/>
+                <w:lang w:val="en-IN"/>
               </w:rPr>
               <w:t xml:space="preserve">, </w:t>
             </w:r>
             <w:r>
               <w:rPr>
                 <w:rFonts w:ascii="Calibri" w:hAnsi="Calibri" w:cs="Calibri"/>
-              </w:rPr>
-              <w:t>Jenkins, XLR</w:t>
-            </w:r>
-            <w:r>
-              <w:rPr>
-                <w:rFonts w:ascii="Calibri" w:hAnsi="Calibri" w:cs="Calibri"/>
-              </w:rPr>
-              <w:t>, Docker</w:t>
-            </w:r>
-            <w:r>
-              <w:rPr>
-                <w:rFonts w:ascii="Calibri" w:hAnsi="Calibri" w:cs="Calibri"/>
-              </w:rPr>
-              <w:t xml:space="preserve">, </w:t>
-            </w:r>
-            <w:r>
-              <w:rPr>
-                <w:rFonts w:ascii="Calibri" w:hAnsi="Calibri" w:cs="Calibri"/>
-              </w:rPr>
-              <w:t>Kubernetes</w:t>
-            </w:r>
-            <w:r>
-              <w:rPr>
-                <w:rFonts w:ascii="Calibri" w:hAnsi="Calibri" w:cs="Calibri"/>
-              </w:rPr>
-              <w:t>, AWS</w:t>
-            </w:r>
-          </w:p>
-          <w:p>
-            <w:pPr>
-              <w:pStyle w:val="Achievement"/>
-              <w:rPr>
-                <w:rFonts w:ascii="Calibri" w:hAnsi="Calibri" w:cs="Calibri"/>
-              </w:rPr>
-            </w:pPr>
-            <w:r>
-              <w:rPr>
-                <w:rFonts w:ascii="Calibri" w:hAnsi="Calibri" w:cs="Calibri"/>
-              </w:rPr>
-              <w:t xml:space="preserve">Data Structures &amp; Algorithms, </w:t>
-            </w:r>
-            <w:r>
-              <w:rPr>
-                <w:rFonts w:ascii="Calibri" w:hAnsi="Calibri" w:cs="Calibri"/>
-              </w:rPr>
-              <w:t>Web Development, iOS Development, Machine Learning</w:t>
+                <w:lang w:val="en-IN"/>
+              </w:rPr>
+              <w:t>and CICD tools like Jenkins</w:t>
+            </w:r>
+            <w:r>
+              <w:rPr>
+                <w:rFonts w:ascii="Calibri" w:hAnsi="Calibri" w:cs="Calibri"/>
+                <w:lang w:val="en-IN"/>
+              </w:rPr>
+              <w:t xml:space="preserve">. </w:t>
+            </w:r>
+            <w:r>
+              <w:rPr>
+                <w:rFonts w:ascii="Calibri" w:hAnsi="Calibri" w:cs="Calibri"/>
+                <w:lang w:val="en-IN"/>
+              </w:rPr>
+              <w:t xml:space="preserve">Familiar with </w:t>
+            </w:r>
+            <w:r>
+              <w:rPr>
+                <w:rFonts w:ascii="Calibri" w:hAnsi="Calibri" w:cs="Calibri"/>
+                <w:lang w:val="en-IN"/>
+              </w:rPr>
+              <w:t>Docker</w:t>
+            </w:r>
+            <w:r>
+              <w:rPr>
+                <w:rFonts w:ascii="Calibri" w:hAnsi="Calibri" w:cs="Calibri"/>
+                <w:lang w:val="en-IN"/>
+              </w:rPr>
+              <w:t xml:space="preserve"> and </w:t>
+            </w:r>
+            <w:r>
+              <w:rPr>
+                <w:rFonts w:ascii="Calibri" w:hAnsi="Calibri" w:cs="Calibri"/>
+                <w:lang w:val="en-IN"/>
+              </w:rPr>
+              <w:t>K8s</w:t>
+            </w:r>
+            <w:r>
+              <w:rPr>
+                <w:rFonts w:ascii="Calibri" w:hAnsi="Calibri" w:cs="Calibri"/>
+                <w:lang w:val="en-IN"/>
+              </w:rPr>
+              <w:t xml:space="preserve"> fundamentals.</w:t>
+            </w:r>
+            <w:r>
+              <w:rPr>
+                <w:rFonts w:ascii="Calibri" w:hAnsi="Calibri" w:cs="Calibri"/>
+                <w:lang w:val="en-IN"/>
+              </w:rPr>
+              <w:t xml:space="preserve"> </w:t>
+            </w:r>
+            <w:r>
+              <w:rPr>
+                <w:rFonts w:ascii="Calibri" w:hAnsi="Calibri" w:cs="Calibri"/>
+                <w:lang w:val="en-IN"/>
+              </w:rPr>
+              <w:t xml:space="preserve">Experience with </w:t>
+            </w:r>
+            <w:r>
+              <w:rPr>
+                <w:rFonts w:ascii="Calibri" w:hAnsi="Calibri" w:cs="Calibri"/>
+                <w:lang w:val="en-IN"/>
+              </w:rPr>
+              <w:t xml:space="preserve">AWS S3, EC2, Lambda, </w:t>
+            </w:r>
+            <w:r>
+              <w:rPr>
+                <w:rFonts w:ascii="Calibri" w:hAnsi="Calibri" w:cs="Calibri"/>
+                <w:lang w:val="en-IN"/>
+              </w:rPr>
+              <w:t xml:space="preserve">IAM, </w:t>
+            </w:r>
+            <w:r>
+              <w:rPr>
+                <w:rFonts w:ascii="Calibri" w:hAnsi="Calibri" w:cs="Calibri"/>
+                <w:lang w:val="en-IN"/>
+              </w:rPr>
+              <w:t xml:space="preserve">SES, </w:t>
+            </w:r>
+            <w:r>
+              <w:rPr>
+                <w:rFonts w:ascii="Calibri" w:hAnsi="Calibri" w:cs="Calibri"/>
+                <w:lang w:val="en-IN"/>
+              </w:rPr>
+              <w:t xml:space="preserve">and </w:t>
+            </w:r>
+            <w:r>
+              <w:rPr>
+                <w:rFonts w:ascii="Calibri" w:hAnsi="Calibri" w:cs="Calibri"/>
+                <w:lang w:val="en-IN"/>
+              </w:rPr>
+              <w:t>Route 53</w:t>
+            </w:r>
+            <w:r>
+              <w:rPr>
+                <w:rFonts w:ascii="Calibri" w:hAnsi="Calibri" w:cs="Calibri"/>
+                <w:lang w:val="en-IN"/>
+              </w:rPr>
+              <w:t xml:space="preserve"> for </w:t>
+            </w:r>
+            <w:r>
+              <w:rPr>
+                <w:rFonts w:ascii="Calibri" w:hAnsi="Calibri" w:cs="Calibri"/>
+                <w:lang w:val="en-IN"/>
+              </w:rPr>
+              <w:t>personal</w:t>
+            </w:r>
+            <w:r>
+              <w:rPr>
+                <w:rFonts w:ascii="Calibri" w:hAnsi="Calibri" w:cs="Calibri"/>
+                <w:lang w:val="en-IN"/>
+              </w:rPr>
+              <w:t xml:space="preserve"> projects</w:t>
+            </w:r>
+            <w:r>
+              <w:rPr>
+                <w:rFonts w:ascii="Calibri" w:hAnsi="Calibri" w:cs="Calibri"/>
+                <w:lang w:val="en-IN"/>
+              </w:rPr>
+              <w:t>.</w:t>
             </w:r>
           </w:p>
           <w:p>
@@ -2153,6 +2665,7 @@
               <w:ind w:left="252"/>
               <w:rPr>
                 <w:rFonts w:ascii="Calibri" w:hAnsi="Calibri" w:cs="Calibri"/>
+                <w:lang w:val="en-IN"/>
               </w:rPr>
             </w:pPr>
           </w:p>
@@ -2317,7 +2830,7 @@
               </w:rPr>
               <w:t xml:space="preserve"> Credential ID: </w:t>
             </w:r>
-            <w:hyperlink r:id="rId8" w:history="1">
+            <w:hyperlink r:id="rId9" w:history="1">
               <w:r>
                 <w:rPr>
                   <w:rStyle w:val="Hyperlink"/>
@@ -2409,42 +2922,131 @@
                 <w:szCs w:val="20"/>
               </w:rPr>
             </w:pPr>
+            <w:bookmarkStart w:id="13" w:name="_Hlk158942803"/>
             <w:r>
               <w:rPr>
                 <w:rFonts w:ascii="Calibri" w:hAnsi="Calibri" w:cs="Calibri"/>
                 <w:b/>
-                <w:sz w:val="20"/>
-                <w:szCs w:val="20"/>
-              </w:rPr>
-              <w:t xml:space="preserve">Cosmic Artifact Filter: </w:t>
-            </w:r>
-            <w:r>
-              <w:rPr>
-                <w:rFonts w:ascii="Calibri" w:hAnsi="Calibri" w:cs="Calibri"/>
                 <w:bCs/>
                 <w:sz w:val="20"/>
                 <w:szCs w:val="20"/>
               </w:rPr>
-              <w:t>Trained a deep learning model</w:t>
-            </w:r>
-            <w:r>
-              <w:rPr>
-                <w:rFonts w:ascii="Calibri" w:hAnsi="Calibri" w:cs="Calibri"/>
-                <w:bCs/>
-                <w:sz w:val="20"/>
-                <w:szCs w:val="20"/>
-              </w:rPr>
-              <w:t xml:space="preserve"> using fast.ai</w:t>
-            </w:r>
-            <w:r>
-              <w:rPr>
-                <w:rFonts w:ascii="Calibri" w:hAnsi="Calibri" w:cs="Calibri"/>
-                <w:bCs/>
-                <w:sz w:val="20"/>
-                <w:szCs w:val="20"/>
-              </w:rPr>
-              <w:t xml:space="preserve"> to flag cosmic ray artifacts in satellite imagery for deeper analysis using image data from NASA’s MESSENGER Spacecraft orbiting the planet Mercury.</w:t>
-            </w:r>
+              <w:t xml:space="preserve">Online Presence: </w:t>
+            </w:r>
+            <w:r>
+              <w:rPr>
+                <w:rFonts w:ascii="Calibri" w:hAnsi="Calibri" w:cs="Calibri"/>
+                <w:sz w:val="20"/>
+                <w:szCs w:val="20"/>
+              </w:rPr>
+              <w:t xml:space="preserve">Developed a website at </w:t>
+            </w:r>
+            <w:hyperlink r:id="rId10" w:history="1">
+              <w:r>
+                <w:rPr>
+                  <w:rStyle w:val="Hyperlink"/>
+                  <w:rFonts w:ascii="Calibri" w:hAnsi="Calibri" w:cs="Calibri"/>
+                  <w:sz w:val="20"/>
+                  <w:szCs w:val="20"/>
+                </w:rPr>
+                <w:t>https://harshitjindal.com</w:t>
+              </w:r>
+            </w:hyperlink>
+            <w:r>
+              <w:rPr>
+                <w:rFonts w:ascii="Calibri" w:hAnsi="Calibri" w:cs="Calibri"/>
+                <w:sz w:val="20"/>
+                <w:szCs w:val="20"/>
+              </w:rPr>
+              <w:t xml:space="preserve"> to host static content such as resume, grade sheets, and custom links like </w:t>
+            </w:r>
+            <w:hyperlink r:id="rId11" w:history="1">
+              <w:r>
+                <w:rPr>
+                  <w:rStyle w:val="Hyperlink"/>
+                  <w:rFonts w:ascii="Calibri" w:hAnsi="Calibri" w:cs="Calibri"/>
+                  <w:sz w:val="20"/>
+                  <w:szCs w:val="20"/>
+                </w:rPr>
+                <w:t>https://harshitjindal.com/linkedin</w:t>
+              </w:r>
+            </w:hyperlink>
+            <w:r>
+              <w:rPr>
+                <w:rFonts w:ascii="Calibri" w:hAnsi="Calibri" w:cs="Calibri"/>
+                <w:sz w:val="20"/>
+                <w:szCs w:val="20"/>
+              </w:rPr>
+              <w:t xml:space="preserve"> for easy navigation. Used DNS management to set up a personalized domain name (CNAME) and </w:t>
+            </w:r>
+            <w:hyperlink r:id="rId12" w:history="1">
+              <w:r>
+                <w:rPr>
+                  <w:rStyle w:val="Hyperlink"/>
+                  <w:rFonts w:ascii="Calibri" w:hAnsi="Calibri" w:cs="Calibri"/>
+                  <w:sz w:val="20"/>
+                  <w:szCs w:val="20"/>
+                </w:rPr>
+                <w:t>contact@harshitjindal.com</w:t>
+              </w:r>
+            </w:hyperlink>
+            <w:r>
+              <w:rPr>
+                <w:rFonts w:ascii="Calibri" w:hAnsi="Calibri" w:cs="Calibri"/>
+                <w:sz w:val="20"/>
+                <w:szCs w:val="20"/>
+              </w:rPr>
+              <w:t xml:space="preserve"> (MX records) for both </w:t>
+            </w:r>
+            <w:r>
+              <w:rPr>
+                <w:rFonts w:ascii="Calibri" w:hAnsi="Calibri" w:cs="Calibri"/>
+                <w:sz w:val="20"/>
+                <w:szCs w:val="20"/>
+              </w:rPr>
+              <w:t>inbound</w:t>
+            </w:r>
+            <w:r>
+              <w:rPr>
+                <w:rFonts w:ascii="Calibri" w:hAnsi="Calibri" w:cs="Calibri"/>
+                <w:sz w:val="20"/>
+                <w:szCs w:val="20"/>
+              </w:rPr>
+              <w:t xml:space="preserve"> and </w:t>
+            </w:r>
+            <w:r>
+              <w:rPr>
+                <w:rFonts w:ascii="Calibri" w:hAnsi="Calibri" w:cs="Calibri"/>
+                <w:sz w:val="20"/>
+                <w:szCs w:val="20"/>
+              </w:rPr>
+              <w:t>outbound</w:t>
+            </w:r>
+            <w:r>
+              <w:rPr>
+                <w:rFonts w:ascii="Calibri" w:hAnsi="Calibri" w:cs="Calibri"/>
+                <w:sz w:val="20"/>
+                <w:szCs w:val="20"/>
+              </w:rPr>
+              <w:t xml:space="preserve"> </w:t>
+            </w:r>
+            <w:r>
+              <w:rPr>
+                <w:rFonts w:ascii="Calibri" w:hAnsi="Calibri" w:cs="Calibri"/>
+                <w:sz w:val="20"/>
+                <w:szCs w:val="20"/>
+              </w:rPr>
+              <w:t>emails</w:t>
+            </w:r>
+            <w:r>
+              <w:rPr>
+                <w:rFonts w:ascii="Calibri" w:hAnsi="Calibri" w:cs="Calibri"/>
+                <w:sz w:val="20"/>
+                <w:szCs w:val="20"/>
+              </w:rPr>
+              <w:t>.</w:t>
+            </w:r>
+            <w:bookmarkEnd w:id="13"/>
           </w:p>
           <w:p>
             <w:pPr>
@@ -2470,7 +3072,7 @@
                 <w:sz w:val="20"/>
                 <w:szCs w:val="20"/>
               </w:rPr>
-              <w:t xml:space="preserve">Dark Matter Discovery: </w:t>
+              <w:t xml:space="preserve">Cosmic Artifact Filter: </w:t>
             </w:r>
             <w:r>
               <w:rPr>
@@ -2479,7 +3081,25 @@
                 <w:sz w:val="20"/>
                 <w:szCs w:val="20"/>
               </w:rPr>
-              <w:t>Built a pipeline to visualize and confirm the presence of dark matter in cosmic data based on the principle of Strong Gravitational Lensing, using PyAutoLens.</w:t>
+              <w:t>Trained a deep learning model</w:t>
+            </w:r>
+            <w:r>
+              <w:rPr>
+                <w:rFonts w:ascii="Calibri" w:hAnsi="Calibri" w:cs="Calibri"/>
+                <w:bCs/>
+                <w:sz w:val="20"/>
+                <w:szCs w:val="20"/>
+              </w:rPr>
+              <w:t xml:space="preserve"> using fast.ai</w:t>
+            </w:r>
+            <w:r>
+              <w:rPr>
+                <w:rFonts w:ascii="Calibri" w:hAnsi="Calibri" w:cs="Calibri"/>
+                <w:bCs/>
+                <w:sz w:val="20"/>
+                <w:szCs w:val="20"/>
+              </w:rPr>
+              <w:t xml:space="preserve"> to flag cosmic ray artifacts in satellite imagery for deeper analysis using image data from NASA’s MESSENGER Spacecraft orbiting the planet Mercury.</w:t>
             </w:r>
           </w:p>
           <w:p>
@@ -2506,57 +3126,16 @@
                 <w:sz w:val="20"/>
                 <w:szCs w:val="20"/>
               </w:rPr>
-              <w:t xml:space="preserve">Live </w:t>
-            </w:r>
-            <w:r>
-              <w:rPr>
-                <w:rFonts w:ascii="Calibri" w:hAnsi="Calibri" w:cs="Calibri"/>
-                <w:b/>
-                <w:sz w:val="20"/>
-                <w:szCs w:val="20"/>
-              </w:rPr>
-              <w:t>Accident Detection:</w:t>
-            </w:r>
-            <w:r>
-              <w:rPr>
-                <w:rFonts w:ascii="Calibri" w:hAnsi="Calibri" w:cs="Calibri"/>
-                <w:sz w:val="20"/>
-                <w:szCs w:val="20"/>
-              </w:rPr>
-              <w:t xml:space="preserve"> Used transfer learning to train a</w:t>
-            </w:r>
-            <w:r>
-              <w:rPr>
-                <w:rFonts w:ascii="Calibri" w:hAnsi="Calibri" w:cs="Calibri"/>
-                <w:sz w:val="20"/>
-                <w:szCs w:val="20"/>
-              </w:rPr>
-              <w:t xml:space="preserve"> ML</w:t>
-            </w:r>
-            <w:r>
-              <w:rPr>
-                <w:rFonts w:ascii="Calibri" w:hAnsi="Calibri" w:cs="Calibri"/>
-                <w:sz w:val="20"/>
-                <w:szCs w:val="20"/>
-              </w:rPr>
-              <w:t xml:space="preserve"> model capable of processing live video camera feed at traffic intersections to spot road accidents. Secured 3</w:t>
-            </w:r>
-            <w:r>
-              <w:rPr>
-                <w:rFonts w:ascii="Calibri" w:hAnsi="Calibri" w:cs="Calibri"/>
-                <w:sz w:val="20"/>
-                <w:szCs w:val="20"/>
-                <w:vertAlign w:val="superscript"/>
-              </w:rPr>
-              <w:t>rd</w:t>
-            </w:r>
-            <w:r>
-              <w:rPr>
-                <w:rFonts w:ascii="Calibri" w:hAnsi="Calibri" w:cs="Calibri"/>
-                <w:sz w:val="20"/>
-                <w:szCs w:val="20"/>
-              </w:rPr>
-              <w:t xml:space="preserve"> place at OctaHacks Hackathon 2019.</w:t>
+              <w:t xml:space="preserve">Dark Matter Discovery: </w:t>
+            </w:r>
+            <w:r>
+              <w:rPr>
+                <w:rFonts w:ascii="Calibri" w:hAnsi="Calibri" w:cs="Calibri"/>
+                <w:bCs/>
+                <w:sz w:val="20"/>
+                <w:szCs w:val="20"/>
+              </w:rPr>
+              <w:t>Built a pipeline to visualize and confirm the presence of dark matter in cosmic data based on the principle of Strong Gravitational Lensing, using PyAutoLens.</w:t>
             </w:r>
           </w:p>
           <w:p>
@@ -2580,67 +3159,60 @@
               <w:rPr>
                 <w:rFonts w:ascii="Calibri" w:hAnsi="Calibri" w:cs="Calibri"/>
                 <w:b/>
-                <w:bCs/>
-                <w:sz w:val="20"/>
-                <w:szCs w:val="20"/>
-              </w:rPr>
-              <w:t>[Brain-Computer Interfacing] Cognitive Neuroscience:</w:t>
-            </w:r>
-            <w:r>
-              <w:rPr>
-                <w:rFonts w:ascii="Calibri" w:hAnsi="Calibri" w:cs="Calibri"/>
-                <w:sz w:val="20"/>
-                <w:szCs w:val="20"/>
-              </w:rPr>
-              <w:t xml:space="preserve"> Wrote </w:t>
-            </w:r>
-            <w:r>
-              <w:rPr>
-                <w:rFonts w:ascii="Calibri" w:hAnsi="Calibri" w:cs="Calibri"/>
-                <w:sz w:val="20"/>
-                <w:szCs w:val="20"/>
-              </w:rPr>
-              <w:t xml:space="preserve">Arduino </w:t>
-            </w:r>
-            <w:r>
-              <w:rPr>
-                <w:rFonts w:ascii="Calibri" w:hAnsi="Calibri" w:cs="Calibri"/>
-                <w:sz w:val="20"/>
-                <w:szCs w:val="20"/>
-              </w:rPr>
-              <w:t>software</w:t>
-            </w:r>
-            <w:r>
-              <w:rPr>
-                <w:rFonts w:ascii="Calibri" w:hAnsi="Calibri" w:cs="Calibri"/>
-                <w:sz w:val="20"/>
-                <w:szCs w:val="20"/>
-              </w:rPr>
-              <w:t xml:space="preserve"> in C</w:t>
-            </w:r>
-            <w:r>
-              <w:rPr>
-                <w:rFonts w:ascii="Calibri" w:hAnsi="Calibri" w:cs="Calibri"/>
-                <w:sz w:val="20"/>
-                <w:szCs w:val="20"/>
-              </w:rPr>
-              <w:t xml:space="preserve"> to detect muscle artifacts in real-time EEG data </w:t>
-            </w:r>
-            <w:r>
-              <w:rPr>
-                <w:rFonts w:ascii="Calibri" w:hAnsi="Calibri" w:cs="Calibri"/>
-                <w:sz w:val="20"/>
-                <w:szCs w:val="20"/>
-              </w:rPr>
-              <w:t xml:space="preserve">collected </w:t>
-            </w:r>
-            <w:r>
-              <w:rPr>
-                <w:rFonts w:ascii="Calibri" w:hAnsi="Calibri" w:cs="Calibri"/>
-                <w:sz w:val="20"/>
-                <w:szCs w:val="20"/>
-              </w:rPr>
-              <w:t>from the NeuroSky MindWave headset, with the potential for upgraded brain mapping by attenuation of the recognized artifacts. It was tested on the Left Frontal Lobe with &gt;95% accuracy.</w:t>
+                <w:sz w:val="20"/>
+                <w:szCs w:val="20"/>
+              </w:rPr>
+              <w:t xml:space="preserve">Live </w:t>
+            </w:r>
+            <w:r>
+              <w:rPr>
+                <w:rFonts w:ascii="Calibri" w:hAnsi="Calibri" w:cs="Calibri"/>
+                <w:b/>
+                <w:sz w:val="20"/>
+                <w:szCs w:val="20"/>
+              </w:rPr>
+              <w:t>Accident Detection:</w:t>
+            </w:r>
+            <w:r>
+              <w:rPr>
+                <w:rFonts w:ascii="Calibri" w:hAnsi="Calibri" w:cs="Calibri"/>
+                <w:sz w:val="20"/>
+                <w:szCs w:val="20"/>
+              </w:rPr>
+              <w:t xml:space="preserve"> Used transfer learning to train a</w:t>
+            </w:r>
+            <w:r>
+              <w:rPr>
+                <w:rFonts w:ascii="Calibri" w:hAnsi="Calibri" w:cs="Calibri"/>
+                <w:sz w:val="20"/>
+                <w:szCs w:val="20"/>
+              </w:rPr>
+              <w:t xml:space="preserve"> ML</w:t>
+            </w:r>
+            <w:r>
+              <w:rPr>
+                <w:rFonts w:ascii="Calibri" w:hAnsi="Calibri" w:cs="Calibri"/>
+                <w:sz w:val="20"/>
+                <w:szCs w:val="20"/>
+              </w:rPr>
+              <w:t xml:space="preserve"> model capable of processing live video camera feed at traffic intersections to spot road accidents. Secured 3</w:t>
+            </w:r>
+            <w:r>
+              <w:rPr>
+                <w:rFonts w:ascii="Calibri" w:hAnsi="Calibri" w:cs="Calibri"/>
+                <w:sz w:val="20"/>
+                <w:szCs w:val="20"/>
+                <w:vertAlign w:val="superscript"/>
+              </w:rPr>
+              <w:t>rd</w:t>
+            </w:r>
+            <w:r>
+              <w:rPr>
+                <w:rFonts w:ascii="Calibri" w:hAnsi="Calibri" w:cs="Calibri"/>
+                <w:sz w:val="20"/>
+                <w:szCs w:val="20"/>
+              </w:rPr>
+              <w:t xml:space="preserve"> place at OctaHacks Hackathon 2019.</w:t>
             </w:r>
           </w:p>
           <w:p>
@@ -2668,190 +3240,180 @@
                 <w:sz w:val="20"/>
                 <w:szCs w:val="20"/>
               </w:rPr>
-              <w:t>[iOS Software</w:t>
-            </w:r>
-            <w:r>
-              <w:rPr>
-                <w:rFonts w:ascii="Calibri" w:hAnsi="Calibri" w:cs="Calibri"/>
-                <w:b/>
-                <w:sz w:val="20"/>
-                <w:szCs w:val="20"/>
-              </w:rPr>
-              <w:t xml:space="preserve"> Development] Price Aggregator for Resellers:</w:t>
-            </w:r>
-            <w:r>
-              <w:rPr>
-                <w:rFonts w:ascii="Calibri" w:hAnsi="Calibri" w:cs="Calibri"/>
-                <w:sz w:val="20"/>
-                <w:szCs w:val="20"/>
-              </w:rPr>
-              <w:t xml:space="preserve"> Developed an</w:t>
-            </w:r>
-            <w:r>
-              <w:rPr>
-                <w:rFonts w:ascii="Calibri" w:hAnsi="Calibri" w:cs="Calibri"/>
-                <w:sz w:val="20"/>
-                <w:szCs w:val="20"/>
-              </w:rPr>
-              <w:t xml:space="preserve"> iOS</w:t>
-            </w:r>
-            <w:r>
-              <w:rPr>
-                <w:rFonts w:ascii="Calibri" w:hAnsi="Calibri" w:cs="Calibri"/>
-                <w:sz w:val="20"/>
-                <w:szCs w:val="20"/>
-              </w:rPr>
-              <w:t xml:space="preserve"> app</w:t>
-            </w:r>
-            <w:r>
-              <w:rPr>
-                <w:rFonts w:ascii="Calibri" w:hAnsi="Calibri" w:cs="Calibri"/>
-                <w:sz w:val="20"/>
-                <w:szCs w:val="20"/>
-              </w:rPr>
-              <w:t xml:space="preserve"> in Swift</w:t>
-            </w:r>
-            <w:r>
-              <w:rPr>
-                <w:rFonts w:ascii="Calibri" w:hAnsi="Calibri" w:cs="Calibri"/>
-                <w:sz w:val="20"/>
-                <w:szCs w:val="20"/>
-              </w:rPr>
-              <w:t xml:space="preserve"> for a client in Bristol, United States, that scan</w:t>
-            </w:r>
-            <w:r>
-              <w:rPr>
-                <w:rFonts w:ascii="Calibri" w:hAnsi="Calibri" w:cs="Calibri"/>
-                <w:sz w:val="20"/>
-                <w:szCs w:val="20"/>
-              </w:rPr>
-              <w:t>s</w:t>
-            </w:r>
-            <w:r>
-              <w:rPr>
-                <w:rFonts w:ascii="Calibri" w:hAnsi="Calibri" w:cs="Calibri"/>
-                <w:sz w:val="20"/>
-                <w:szCs w:val="20"/>
-              </w:rPr>
-              <w:t xml:space="preserve"> product barcodes using AVFoundation and aggregate</w:t>
-            </w:r>
-            <w:r>
-              <w:rPr>
-                <w:rFonts w:ascii="Calibri" w:hAnsi="Calibri" w:cs="Calibri"/>
-                <w:sz w:val="20"/>
-                <w:szCs w:val="20"/>
-              </w:rPr>
-              <w:t>s</w:t>
-            </w:r>
-            <w:r>
-              <w:rPr>
-                <w:rFonts w:ascii="Calibri" w:hAnsi="Calibri" w:cs="Calibri"/>
-                <w:sz w:val="20"/>
-                <w:szCs w:val="20"/>
-              </w:rPr>
-              <w:t xml:space="preserve"> the price history from different sources</w:t>
-            </w:r>
-            <w:r>
-              <w:rPr>
-                <w:rFonts w:ascii="Calibri" w:hAnsi="Calibri" w:cs="Calibri"/>
-                <w:sz w:val="20"/>
-                <w:szCs w:val="20"/>
-              </w:rPr>
-              <w:t>.</w:t>
-            </w:r>
-          </w:p>
-        </w:tc>
-      </w:tr>
-      <w:tr>
-        <w:trPr>
-          <w:trHeight w:val="195"/>
-        </w:trPr>
-        <w:tc>
-          <w:tcPr>
-            <w:tcW w:w="5000" w:type="pct"/>
-            <w:gridSpan w:val="8"/>
-            <w:tcBorders>
-              <w:bottom w:val="single" w:sz="4" w:space="0" w:color="auto"/>
-            </w:tcBorders>
-            <w:shd w:val="clear" w:color="auto" w:fill="auto"/>
-          </w:tcPr>
-          <w:p>
-            <w:pPr>
-              <w:rPr>
-                <w:rFonts w:ascii="Calibri" w:hAnsi="Calibri" w:cs="Calibri"/>
-                <w:b/>
-                <w:smallCaps/>
-                <w:spacing w:val="86"/>
-                <w:sz w:val="20"/>
-                <w:szCs w:val="20"/>
-              </w:rPr>
-            </w:pPr>
-            <w:r>
-              <w:rPr>
-                <w:rFonts w:ascii="Calibri" w:hAnsi="Calibri" w:cs="Calibri"/>
-                <w:b/>
-                <w:smallCaps/>
-                <w:sz w:val="20"/>
-                <w:szCs w:val="20"/>
-              </w:rPr>
-              <w:t>Volunteer &amp; Additional Experience</w:t>
-            </w:r>
-          </w:p>
-        </w:tc>
-      </w:tr>
-      <w:tr>
-        <w:trPr>
-          <w:trHeight w:val="563"/>
-        </w:trPr>
-        <w:tc>
-          <w:tcPr>
-            <w:tcW w:w="5000" w:type="pct"/>
-            <w:gridSpan w:val="8"/>
-            <w:tcBorders>
-              <w:top w:val="single" w:sz="4" w:space="0" w:color="auto"/>
-            </w:tcBorders>
-            <w:shd w:val="clear" w:color="auto" w:fill="auto"/>
-          </w:tcPr>
-          <w:p>
-            <w:pPr>
-              <w:pStyle w:val="Achievement"/>
-              <w:rPr>
-                <w:rFonts w:ascii="Calibri" w:hAnsi="Calibri" w:cs="Calibri"/>
-              </w:rPr>
-            </w:pPr>
-            <w:r>
-              <w:rPr>
-                <w:rFonts w:ascii="Calibri" w:hAnsi="Calibri" w:cs="Calibri"/>
-                <w:b/>
-              </w:rPr>
-              <w:t>Speaker at the Programming Club, UIET:</w:t>
-            </w:r>
-            <w:r>
-              <w:rPr>
-                <w:rFonts w:ascii="Calibri" w:hAnsi="Calibri" w:cs="Calibri"/>
-              </w:rPr>
-              <w:t xml:space="preserve"> Guided freshmen CS students and taught introductory Machine Learning.</w:t>
+              <w:t>[Brain-Computer Interfacing] Cognitive Neuroscience:</w:t>
+            </w:r>
+            <w:r>
+              <w:rPr>
+                <w:rFonts w:ascii="Calibri" w:hAnsi="Calibri" w:cs="Calibri"/>
+                <w:sz w:val="20"/>
+                <w:szCs w:val="20"/>
+              </w:rPr>
+              <w:t xml:space="preserve"> Wrote </w:t>
+            </w:r>
+            <w:r>
+              <w:rPr>
+                <w:rFonts w:ascii="Calibri" w:hAnsi="Calibri" w:cs="Calibri"/>
+                <w:sz w:val="20"/>
+                <w:szCs w:val="20"/>
+              </w:rPr>
+              <w:t xml:space="preserve">Arduino </w:t>
+            </w:r>
+            <w:r>
+              <w:rPr>
+                <w:rFonts w:ascii="Calibri" w:hAnsi="Calibri" w:cs="Calibri"/>
+                <w:sz w:val="20"/>
+                <w:szCs w:val="20"/>
+              </w:rPr>
+              <w:t>software</w:t>
+            </w:r>
+            <w:r>
+              <w:rPr>
+                <w:rFonts w:ascii="Calibri" w:hAnsi="Calibri" w:cs="Calibri"/>
+                <w:sz w:val="20"/>
+                <w:szCs w:val="20"/>
+              </w:rPr>
+              <w:t xml:space="preserve"> in C</w:t>
+            </w:r>
+            <w:r>
+              <w:rPr>
+                <w:rFonts w:ascii="Calibri" w:hAnsi="Calibri" w:cs="Calibri"/>
+                <w:sz w:val="20"/>
+                <w:szCs w:val="20"/>
+              </w:rPr>
+              <w:t xml:space="preserve"> to detect muscle artifacts in real-time EEG data </w:t>
+            </w:r>
+            <w:r>
+              <w:rPr>
+                <w:rFonts w:ascii="Calibri" w:hAnsi="Calibri" w:cs="Calibri"/>
+                <w:sz w:val="20"/>
+                <w:szCs w:val="20"/>
+              </w:rPr>
+              <w:t xml:space="preserve">collected </w:t>
+            </w:r>
+            <w:r>
+              <w:rPr>
+                <w:rFonts w:ascii="Calibri" w:hAnsi="Calibri" w:cs="Calibri"/>
+                <w:sz w:val="20"/>
+                <w:szCs w:val="20"/>
+              </w:rPr>
+              <w:t>from the NeuroSky MindWave headset, with the potential for upgraded brain mapping by attenuation of the recognized artifacts. It was tested on the Left Frontal Lobe with &gt;95% accuracy.</w:t>
             </w:r>
           </w:p>
           <w:p>
             <w:pPr>
-              <w:pStyle w:val="Achievement"/>
-              <w:rPr>
-                <w:rFonts w:ascii="Calibri" w:hAnsi="Calibri" w:cs="Calibri"/>
+              <w:numPr>
+                <w:ilvl w:val="0"/>
+                <w:numId w:val="7"/>
+              </w:numPr>
+              <w:tabs>
+                <w:tab w:val="clear" w:pos="916"/>
+              </w:tabs>
+              <w:ind w:left="252" w:hanging="180"/>
+              <w:jc w:val="both"/>
+              <w:rPr>
+                <w:rFonts w:ascii="Calibri" w:hAnsi="Calibri" w:cs="Calibri"/>
+                <w:sz w:val="20"/>
+                <w:szCs w:val="20"/>
               </w:rPr>
             </w:pPr>
             <w:r>
               <w:rPr>
                 <w:rFonts w:ascii="Calibri" w:hAnsi="Calibri" w:cs="Calibri"/>
                 <w:b/>
-              </w:rPr>
-              <w:t>Mowgli Aid:</w:t>
-            </w:r>
-            <w:r>
-              <w:rPr>
-                <w:rFonts w:ascii="Calibri" w:hAnsi="Calibri" w:cs="Calibri"/>
-              </w:rPr>
-              <w:t xml:space="preserve"> Volunteering to rescue and rehabilitate stray and injured animals in the Chandigarh Tricity Area.</w:t>
+                <w:bCs/>
+                <w:sz w:val="20"/>
+                <w:szCs w:val="20"/>
+              </w:rPr>
+              <w:t>[iOS Software</w:t>
+            </w:r>
+            <w:r>
+              <w:rPr>
+                <w:rFonts w:ascii="Calibri" w:hAnsi="Calibri" w:cs="Calibri"/>
+                <w:b/>
+                <w:sz w:val="20"/>
+                <w:szCs w:val="20"/>
+              </w:rPr>
+              <w:t xml:space="preserve"> Development] Price Aggregator for Resellers:</w:t>
+            </w:r>
+            <w:r>
+              <w:rPr>
+                <w:rFonts w:ascii="Calibri" w:hAnsi="Calibri" w:cs="Calibri"/>
+                <w:sz w:val="20"/>
+                <w:szCs w:val="20"/>
+              </w:rPr>
+              <w:t xml:space="preserve"> Developed an</w:t>
+            </w:r>
+            <w:r>
+              <w:rPr>
+                <w:rFonts w:ascii="Calibri" w:hAnsi="Calibri" w:cs="Calibri"/>
+                <w:sz w:val="20"/>
+                <w:szCs w:val="20"/>
+              </w:rPr>
+              <w:t xml:space="preserve"> iOS</w:t>
+            </w:r>
+            <w:r>
+              <w:rPr>
+                <w:rFonts w:ascii="Calibri" w:hAnsi="Calibri" w:cs="Calibri"/>
+                <w:sz w:val="20"/>
+                <w:szCs w:val="20"/>
+              </w:rPr>
+              <w:t xml:space="preserve"> app</w:t>
+            </w:r>
+            <w:r>
+              <w:rPr>
+                <w:rFonts w:ascii="Calibri" w:hAnsi="Calibri" w:cs="Calibri"/>
+                <w:sz w:val="20"/>
+                <w:szCs w:val="20"/>
+              </w:rPr>
+              <w:t xml:space="preserve"> in Swift</w:t>
+            </w:r>
+            <w:r>
+              <w:rPr>
+                <w:rFonts w:ascii="Calibri" w:hAnsi="Calibri" w:cs="Calibri"/>
+                <w:sz w:val="20"/>
+                <w:szCs w:val="20"/>
+              </w:rPr>
+              <w:t xml:space="preserve"> that scan</w:t>
+            </w:r>
+            <w:r>
+              <w:rPr>
+                <w:rFonts w:ascii="Calibri" w:hAnsi="Calibri" w:cs="Calibri"/>
+                <w:sz w:val="20"/>
+                <w:szCs w:val="20"/>
+              </w:rPr>
+              <w:t>s</w:t>
+            </w:r>
+            <w:r>
+              <w:rPr>
+                <w:rFonts w:ascii="Calibri" w:hAnsi="Calibri" w:cs="Calibri"/>
+                <w:sz w:val="20"/>
+                <w:szCs w:val="20"/>
+              </w:rPr>
+              <w:t xml:space="preserve"> product barcodes using AVFoundation and aggregate</w:t>
+            </w:r>
+            <w:r>
+              <w:rPr>
+                <w:rFonts w:ascii="Calibri" w:hAnsi="Calibri" w:cs="Calibri"/>
+                <w:sz w:val="20"/>
+                <w:szCs w:val="20"/>
+              </w:rPr>
+              <w:t>s</w:t>
+            </w:r>
+            <w:r>
+              <w:rPr>
+                <w:rFonts w:ascii="Calibri" w:hAnsi="Calibri" w:cs="Calibri"/>
+                <w:sz w:val="20"/>
+                <w:szCs w:val="20"/>
+              </w:rPr>
+              <w:t xml:space="preserve"> the price history from different sources</w:t>
+            </w:r>
+            <w:r>
+              <w:rPr>
+                <w:rFonts w:ascii="Calibri" w:hAnsi="Calibri" w:cs="Calibri"/>
+                <w:sz w:val="20"/>
+                <w:szCs w:val="20"/>
+              </w:rPr>
+              <w:t>.</w:t>
             </w:r>
           </w:p>
         </w:tc>
@@ -3057,6 +3619,155 @@
     </w:lvl>
   </w:abstractNum>
   <w:abstractNum w:abstractNumId="1" w15:restartNumberingAfterBreak="0">
+    <w:nsid w:val="0EFC0313"/>
+    <w:multiLevelType w:val="multilevel"/>
+    <w:tmpl w:val="2C040166"/>
+    <w:lvl w:ilvl="0">
+      <w:start w:val="1"/>
+      <w:numFmt w:val="bullet"/>
+      <w:lvlText w:val=""/>
+      <w:lvlJc w:val="left"/>
+      <w:pPr>
+        <w:tabs>
+          <w:tab w:val="num" w:pos="720"/>
+        </w:tabs>
+        <w:ind w:left="720" w:hanging="360"/>
+      </w:pPr>
+      <w:rPr>
+        <w:rFonts w:ascii="Symbol" w:hAnsi="Symbol" w:hint="default"/>
+        <w:sz w:val="20"/>
+      </w:rPr>
+    </w:lvl>
+    <w:lvl w:ilvl="1" w:tentative="1">
+      <w:start w:val="1"/>
+      <w:numFmt w:val="bullet"/>
+      <w:lvlText w:val=""/>
+      <w:lvlJc w:val="left"/>
+      <w:pPr>
+        <w:tabs>
+          <w:tab w:val="num" w:pos="1440"/>
+        </w:tabs>
+        <w:ind w:left="1440" w:hanging="360"/>
+      </w:pPr>
+      <w:rPr>
+        <w:rFonts w:ascii="Symbol" w:hAnsi="Symbol" w:hint="default"/>
+        <w:sz w:val="20"/>
+      </w:rPr>
+    </w:lvl>
+    <w:lvl w:ilvl="2" w:tentative="1">
+      <w:start w:val="1"/>
+      <w:numFmt w:val="bullet"/>
+      <w:lvlText w:val=""/>
+      <w:lvlJc w:val="left"/>
+      <w:pPr>
+        <w:tabs>
+          <w:tab w:val="num" w:pos="2160"/>
+        </w:tabs>
+        <w:ind w:left="2160" w:hanging="360"/>
+      </w:pPr>
+      <w:rPr>
+        <w:rFonts w:ascii="Symbol" w:hAnsi="Symbol" w:hint="default"/>
+        <w:sz w:val="20"/>
+      </w:rPr>
+    </w:lvl>
+    <w:lvl w:ilvl="3" w:tentative="1">
+      <w:start w:val="1"/>
+      <w:numFmt w:val="bullet"/>
+      <w:lvlText w:val=""/>
+      <w:lvlJc w:val="left"/>
+      <w:pPr>
+        <w:tabs>
+          <w:tab w:val="num" w:pos="2880"/>
+        </w:tabs>
+        <w:ind w:left="2880" w:hanging="360"/>
+      </w:pPr>
+      <w:rPr>
+        <w:rFonts w:ascii="Symbol" w:hAnsi="Symbol" w:hint="default"/>
+        <w:sz w:val="20"/>
+      </w:rPr>
+    </w:lvl>
+    <w:lvl w:ilvl="4" w:tentative="1">
+      <w:start w:val="1"/>
+      <w:numFmt w:val="bullet"/>
+      <w:lvlText w:val=""/>
+      <w:lvlJc w:val="left"/>
+      <w:pPr>
+        <w:tabs>
+          <w:tab w:val="num" w:pos="3600"/>
+        </w:tabs>
+        <w:ind w:left="3600" w:hanging="360"/>
+      </w:pPr>
+      <w:rPr>
+        <w:rFonts w:ascii="Symbol" w:hAnsi="Symbol" w:hint="default"/>
+        <w:sz w:val="20"/>
+      </w:rPr>
+    </w:lvl>
+    <w:lvl w:ilvl="5" w:tentative="1">
+      <w:start w:val="1"/>
+      <w:numFmt w:val="bullet"/>
+      <w:lvlText w:val=""/>
+      <w:lvlJc w:val="left"/>
+      <w:pPr>
+        <w:tabs>
+          <w:tab w:val="num" w:pos="4320"/>
+        </w:tabs>
+        <w:ind w:left="4320" w:hanging="360"/>
+      </w:pPr>
+      <w:rPr>
+        <w:rFonts w:ascii="Symbol" w:hAnsi="Symbol" w:hint="default"/>
+        <w:sz w:val="20"/>
+      </w:rPr>
+    </w:lvl>
+    <w:lvl w:ilvl="6" w:tentative="1">
+      <w:start w:val="1"/>
+      <w:numFmt w:val="bullet"/>
+      <w:lvlText w:val=""/>
+      <w:lvlJc w:val="left"/>
+      <w:pPr>
+        <w:tabs>
+          <w:tab w:val="num" w:pos="5040"/>
+        </w:tabs>
+        <w:ind w:left="5040" w:hanging="360"/>
+      </w:pPr>
+      <w:rPr>
+        <w:rFonts w:ascii="Symbol" w:hAnsi="Symbol" w:hint="default"/>
+        <w:sz w:val="20"/>
+      </w:rPr>
+    </w:lvl>
+    <w:lvl w:ilvl="7" w:tentative="1">
+      <w:start w:val="1"/>
+      <w:numFmt w:val="bullet"/>
+      <w:lvlText w:val=""/>
+      <w:lvlJc w:val="left"/>
+      <w:pPr>
+        <w:tabs>
+          <w:tab w:val="num" w:pos="5760"/>
+        </w:tabs>
+        <w:ind w:left="5760" w:hanging="360"/>
+      </w:pPr>
+      <w:rPr>
+        <w:rFonts w:ascii="Symbol" w:hAnsi="Symbol" w:hint="default"/>
+        <w:sz w:val="20"/>
+      </w:rPr>
+    </w:lvl>
+    <w:lvl w:ilvl="8" w:tentative="1">
+      <w:start w:val="1"/>
+      <w:numFmt w:val="bullet"/>
+      <w:lvlText w:val=""/>
+      <w:lvlJc w:val="left"/>
+      <w:pPr>
+        <w:tabs>
+          <w:tab w:val="num" w:pos="6480"/>
+        </w:tabs>
+        <w:ind w:left="6480" w:hanging="360"/>
+      </w:pPr>
+      <w:rPr>
+        <w:rFonts w:ascii="Symbol" w:hAnsi="Symbol" w:hint="default"/>
+        <w:sz w:val="20"/>
+      </w:rPr>
+    </w:lvl>
+  </w:abstractNum>
+  <w:abstractNum w:abstractNumId="2" w15:restartNumberingAfterBreak="0">
     <w:nsid w:val="20C727DB"/>
     <w:multiLevelType w:val="hybridMultilevel"/>
     <w:tmpl w:val="58C8715E"/>
@@ -3169,7 +3880,7 @@
       </w:rPr>
     </w:lvl>
   </w:abstractNum>
-  <w:abstractNum w:abstractNumId="2" w15:restartNumberingAfterBreak="0">
+  <w:abstractNum w:abstractNumId="3" w15:restartNumberingAfterBreak="0">
     <w:nsid w:val="218D459C"/>
     <w:multiLevelType w:val="hybridMultilevel"/>
     <w:tmpl w:val="1A6E3490"/>
@@ -3282,7 +3993,7 @@
       </w:rPr>
     </w:lvl>
   </w:abstractNum>
-  <w:abstractNum w:abstractNumId="3" w15:restartNumberingAfterBreak="0">
+  <w:abstractNum w:abstractNumId="4" w15:restartNumberingAfterBreak="0">
     <w:nsid w:val="28C36D3A"/>
     <w:multiLevelType w:val="hybridMultilevel"/>
     <w:tmpl w:val="17462E32"/>
@@ -3425,7 +4136,7 @@
       </w:rPr>
     </w:lvl>
   </w:abstractNum>
-  <w:abstractNum w:abstractNumId="4" w15:restartNumberingAfterBreak="0">
+  <w:abstractNum w:abstractNumId="5" w15:restartNumberingAfterBreak="0">
     <w:nsid w:val="2A525042"/>
     <w:multiLevelType w:val="hybridMultilevel"/>
     <w:tmpl w:val="972E6B8C"/>
@@ -3538,7 +4249,7 @@
       </w:rPr>
     </w:lvl>
   </w:abstractNum>
-  <w:abstractNum w:abstractNumId="5" w15:restartNumberingAfterBreak="0">
+  <w:abstractNum w:abstractNumId="6" w15:restartNumberingAfterBreak="0">
     <w:nsid w:val="37E50D79"/>
     <w:multiLevelType w:val="multilevel"/>
     <w:tmpl w:val="0F56C60A"/>
@@ -3687,7 +4398,7 @@
       </w:rPr>
     </w:lvl>
   </w:abstractNum>
-  <w:abstractNum w:abstractNumId="6" w15:restartNumberingAfterBreak="0">
+  <w:abstractNum w:abstractNumId="7" w15:restartNumberingAfterBreak="0">
     <w:nsid w:val="43EE3875"/>
     <w:multiLevelType w:val="hybridMultilevel"/>
     <w:tmpl w:val="1F2409AA"/>
@@ -3830,7 +4541,7 @@
       </w:rPr>
     </w:lvl>
   </w:abstractNum>
-  <w:abstractNum w:abstractNumId="7" w15:restartNumberingAfterBreak="0">
+  <w:abstractNum w:abstractNumId="8" w15:restartNumberingAfterBreak="0">
     <w:nsid w:val="44E36D24"/>
     <w:multiLevelType w:val="multilevel"/>
     <w:tmpl w:val="C574A1D4"/>
@@ -3973,7 +4684,7 @@
       </w:rPr>
     </w:lvl>
   </w:abstractNum>
-  <w:abstractNum w:abstractNumId="8" w15:restartNumberingAfterBreak="0">
+  <w:abstractNum w:abstractNumId="9" w15:restartNumberingAfterBreak="0">
     <w:nsid w:val="4EA55D92"/>
     <w:multiLevelType w:val="hybridMultilevel"/>
     <w:tmpl w:val="40F8EF08"/>
@@ -4117,7 +4828,7 @@
       </w:rPr>
     </w:lvl>
   </w:abstractNum>
-  <w:abstractNum w:abstractNumId="9" w15:restartNumberingAfterBreak="0">
+  <w:abstractNum w:abstractNumId="10" w15:restartNumberingAfterBreak="0">
     <w:nsid w:val="59D62AF9"/>
     <w:multiLevelType w:val="hybridMultilevel"/>
     <w:tmpl w:val="B0DC66D8"/>
@@ -4230,7 +4941,7 @@
       </w:rPr>
     </w:lvl>
   </w:abstractNum>
-  <w:abstractNum w:abstractNumId="10" w15:restartNumberingAfterBreak="0">
+  <w:abstractNum w:abstractNumId="11" w15:restartNumberingAfterBreak="0">
     <w:nsid w:val="602376DE"/>
     <w:multiLevelType w:val="multilevel"/>
     <w:tmpl w:val="1F2409AA"/>
@@ -4373,7 +5084,7 @@
       </w:rPr>
     </w:lvl>
   </w:abstractNum>
-  <w:abstractNum w:abstractNumId="11" w15:restartNumberingAfterBreak="0">
+  <w:abstractNum w:abstractNumId="12" w15:restartNumberingAfterBreak="0">
     <w:nsid w:val="664F2126"/>
     <w:multiLevelType w:val="hybridMultilevel"/>
     <w:tmpl w:val="DE1EB572"/>
@@ -4486,7 +5197,7 @@
       </w:rPr>
     </w:lvl>
   </w:abstractNum>
-  <w:abstractNum w:abstractNumId="12" w15:restartNumberingAfterBreak="0">
+  <w:abstractNum w:abstractNumId="13" w15:restartNumberingAfterBreak="0">
     <w:nsid w:val="66BE4B9C"/>
     <w:multiLevelType w:val="hybridMultilevel"/>
     <w:tmpl w:val="C574A1D4"/>
@@ -4629,7 +5340,7 @@
       </w:rPr>
     </w:lvl>
   </w:abstractNum>
-  <w:abstractNum w:abstractNumId="13" w15:restartNumberingAfterBreak="0">
+  <w:abstractNum w:abstractNumId="14" w15:restartNumberingAfterBreak="0">
     <w:nsid w:val="6C8E594D"/>
     <w:multiLevelType w:val="hybridMultilevel"/>
     <w:tmpl w:val="4FF2909A"/>
@@ -4772,7 +5483,7 @@
       </w:rPr>
     </w:lvl>
   </w:abstractNum>
-  <w:abstractNum w:abstractNumId="14" w15:restartNumberingAfterBreak="0">
+  <w:abstractNum w:abstractNumId="15" w15:restartNumberingAfterBreak="0">
     <w:nsid w:val="73054A62"/>
     <w:multiLevelType w:val="hybridMultilevel"/>
     <w:tmpl w:val="ABB00A48"/>
@@ -4912,7 +5623,7 @@
       </w:rPr>
     </w:lvl>
   </w:abstractNum>
-  <w:abstractNum w:abstractNumId="15" w15:restartNumberingAfterBreak="0">
+  <w:abstractNum w:abstractNumId="16" w15:restartNumberingAfterBreak="0">
     <w:nsid w:val="7D8828E0"/>
     <w:multiLevelType w:val="hybridMultilevel"/>
     <w:tmpl w:val="B68CC4E6"/>
@@ -5056,52 +5767,55 @@
     </w:lvl>
   </w:abstractNum>
   <w:num w:numId="1" w16cid:durableId="174345982">
-    <w:abstractNumId w:val="6"/>
+    <w:abstractNumId w:val="7"/>
   </w:num>
   <w:num w:numId="2" w16cid:durableId="576591569">
-    <w:abstractNumId w:val="3"/>
+    <w:abstractNumId w:val="4"/>
   </w:num>
   <w:num w:numId="3" w16cid:durableId="1964455288">
-    <w:abstractNumId w:val="8"/>
+    <w:abstractNumId w:val="9"/>
   </w:num>
   <w:num w:numId="4" w16cid:durableId="1809740008">
+    <w:abstractNumId w:val="16"/>
+  </w:num>
+  <w:num w:numId="5" w16cid:durableId="1663850123">
+    <w:abstractNumId w:val="13"/>
+  </w:num>
+  <w:num w:numId="6" w16cid:durableId="1726873998">
     <w:abstractNumId w:val="15"/>
   </w:num>
-  <w:num w:numId="5" w16cid:durableId="1663850123">
-    <w:abstractNumId w:val="12"/>
-  </w:num>
-  <w:num w:numId="6" w16cid:durableId="1726873998">
+  <w:num w:numId="7" w16cid:durableId="1737628104">
     <w:abstractNumId w:val="14"/>
   </w:num>
-  <w:num w:numId="7" w16cid:durableId="1737628104">
-    <w:abstractNumId w:val="13"/>
-  </w:num>
   <w:num w:numId="8" w16cid:durableId="824591776">
-    <w:abstractNumId w:val="10"/>
+    <w:abstractNumId w:val="11"/>
   </w:num>
   <w:num w:numId="9" w16cid:durableId="1081562466">
-    <w:abstractNumId w:val="7"/>
+    <w:abstractNumId w:val="8"/>
   </w:num>
   <w:num w:numId="10" w16cid:durableId="666596524">
     <w:abstractNumId w:val="0"/>
   </w:num>
   <w:num w:numId="11" w16cid:durableId="910847414">
-    <w:abstractNumId w:val="11"/>
+    <w:abstractNumId w:val="12"/>
   </w:num>
   <w:num w:numId="12" w16cid:durableId="1205286574">
-    <w:abstractNumId w:val="4"/>
+    <w:abstractNumId w:val="5"/>
   </w:num>
   <w:num w:numId="13" w16cid:durableId="469830577">
-    <w:abstractNumId w:val="1"/>
+    <w:abstractNumId w:val="2"/>
   </w:num>
   <w:num w:numId="14" w16cid:durableId="219052901">
-    <w:abstractNumId w:val="5"/>
+    <w:abstractNumId w:val="6"/>
   </w:num>
   <w:num w:numId="15" w16cid:durableId="942687552">
-    <w:abstractNumId w:val="2"/>
+    <w:abstractNumId w:val="3"/>
   </w:num>
   <w:num w:numId="16" w16cid:durableId="329216700">
-    <w:abstractNumId w:val="9"/>
+    <w:abstractNumId w:val="10"/>
+  </w:num>
+  <w:num w:numId="17" w16cid:durableId="1901332060">
+    <w:abstractNumId w:val="1"/>
   </w:num>
 </w:numbering>
 </file>

</xml_diff>

<commit_message>
Add Java to resume
</commit_message>
<xml_diff>
--- a/Harshit_Jindal_SDE.docx
+++ b/Harshit_Jindal_SDE.docx
@@ -1010,15 +1010,7 @@
                 <w:sz w:val="20"/>
                 <w:szCs w:val="20"/>
               </w:rPr>
-              <w:t xml:space="preserve"> Additionally, </w:t>
-            </w:r>
-            <w:r>
-              <w:rPr>
-                <w:rFonts w:ascii="Calibri" w:hAnsi="Calibri" w:cs="Calibri"/>
-                <w:sz w:val="20"/>
-                <w:szCs w:val="20"/>
-              </w:rPr>
-              <w:t>coordinated with platform teams for infrastructure maintenance</w:t>
+              <w:t xml:space="preserve"> Additionally, coordinated with platform teams for infrastructure maintenance</w:t>
             </w:r>
             <w:r>
               <w:rPr>
@@ -2004,23 +1996,39 @@
                 <w:sz w:val="20"/>
                 <w:szCs w:val="20"/>
               </w:rPr>
-              <w:t>with current CGPA</w:t>
-            </w:r>
-            <w:r>
-              <w:rPr>
-                <w:rFonts w:ascii="Calibri" w:hAnsi="Calibri" w:cs="Calibri"/>
-                <w:sz w:val="20"/>
-                <w:szCs w:val="20"/>
-              </w:rPr>
-              <w:t xml:space="preserve"> of</w:t>
-            </w:r>
-            <w:r>
-              <w:rPr>
-                <w:rFonts w:ascii="Calibri" w:hAnsi="Calibri" w:cs="Calibri"/>
-                <w:sz w:val="20"/>
-                <w:szCs w:val="20"/>
-              </w:rPr>
-              <w:t xml:space="preserve"> 9.</w:t>
+              <w:t>(work-integrated)</w:t>
+            </w:r>
+            <w:r>
+              <w:rPr>
+                <w:rFonts w:ascii="Calibri" w:hAnsi="Calibri" w:cs="Calibri"/>
+                <w:sz w:val="20"/>
+                <w:szCs w:val="20"/>
+              </w:rPr>
+              <w:t xml:space="preserve">. </w:t>
+            </w:r>
+            <w:r>
+              <w:rPr>
+                <w:rFonts w:ascii="Calibri" w:hAnsi="Calibri" w:cs="Calibri"/>
+                <w:sz w:val="20"/>
+                <w:szCs w:val="20"/>
+              </w:rPr>
+              <w:t>CGPA</w:t>
+            </w:r>
+            <w:r>
+              <w:rPr>
+                <w:rFonts w:ascii="Calibri" w:hAnsi="Calibri" w:cs="Calibri"/>
+                <w:sz w:val="20"/>
+                <w:szCs w:val="20"/>
+              </w:rPr>
+              <w:t xml:space="preserve">: </w:t>
+            </w:r>
+            <w:r>
+              <w:rPr>
+                <w:rFonts w:ascii="Calibri" w:hAnsi="Calibri" w:cs="Calibri"/>
+                <w:sz w:val="20"/>
+                <w:szCs w:val="20"/>
+              </w:rPr>
+              <w:t>9.</w:t>
             </w:r>
             <w:r>
               <w:rPr>
@@ -2031,14 +2039,6 @@
               <w:t>2/10</w:t>
             </w:r>
             <w:bookmarkStart w:id="11" w:name="_Hlk158931231"/>
-            <w:r>
-              <w:rPr>
-                <w:rFonts w:ascii="Calibri" w:hAnsi="Calibri" w:cs="Calibri"/>
-                <w:sz w:val="20"/>
-                <w:szCs w:val="20"/>
-              </w:rPr>
-              <w:t xml:space="preserve"> (work-integrated)</w:t>
-            </w:r>
             <w:r>
               <w:rPr>
                 <w:rFonts w:ascii="Calibri" w:hAnsi="Calibri" w:cs="Calibri"/>
@@ -2325,23 +2325,31 @@
                 <w:sz w:val="20"/>
                 <w:szCs w:val="20"/>
               </w:rPr>
-              <w:t xml:space="preserve"> with CGPA</w:t>
-            </w:r>
-            <w:r>
-              <w:rPr>
-                <w:rFonts w:ascii="Calibri" w:hAnsi="Calibri" w:cs="Calibri"/>
-                <w:sz w:val="20"/>
-                <w:szCs w:val="20"/>
-              </w:rPr>
-              <w:t xml:space="preserve"> of</w:t>
-            </w:r>
-            <w:r>
-              <w:rPr>
-                <w:rFonts w:ascii="Calibri" w:hAnsi="Calibri" w:cs="Calibri"/>
-                <w:sz w:val="20"/>
-                <w:szCs w:val="20"/>
-              </w:rPr>
-              <w:t xml:space="preserve"> 8.2</w:t>
+              <w:t xml:space="preserve">. </w:t>
+            </w:r>
+            <w:r>
+              <w:rPr>
+                <w:rFonts w:ascii="Calibri" w:hAnsi="Calibri" w:cs="Calibri"/>
+                <w:sz w:val="20"/>
+                <w:szCs w:val="20"/>
+              </w:rPr>
+              <w:t>CGPA</w:t>
+            </w:r>
+            <w:r>
+              <w:rPr>
+                <w:rFonts w:ascii="Calibri" w:hAnsi="Calibri" w:cs="Calibri"/>
+                <w:sz w:val="20"/>
+                <w:szCs w:val="20"/>
+              </w:rPr>
+              <w:t xml:space="preserve">: </w:t>
+            </w:r>
+            <w:r>
+              <w:rPr>
+                <w:rFonts w:ascii="Calibri" w:hAnsi="Calibri" w:cs="Calibri"/>
+                <w:sz w:val="20"/>
+                <w:szCs w:val="20"/>
+              </w:rPr>
+              <w:t>8.2</w:t>
             </w:r>
             <w:r>
               <w:rPr>
@@ -2445,25 +2453,34 @@
                 <w:lang w:val="en-IN"/>
               </w:rPr>
             </w:pPr>
+            <w:bookmarkStart w:id="13" w:name="_Hlk164984580"/>
             <w:r>
               <w:rPr>
                 <w:rFonts w:ascii="Calibri" w:hAnsi="Calibri" w:cs="Calibri"/>
                 <w:lang w:val="en-IN"/>
               </w:rPr>
-              <w:t xml:space="preserve">Proficient in </w:t>
+              <w:t xml:space="preserve">Python (work experience), C++ (data structures &amp; algorithms), </w:t>
             </w:r>
             <w:r>
               <w:rPr>
                 <w:rFonts w:ascii="Calibri" w:hAnsi="Calibri" w:cs="Calibri"/>
                 <w:lang w:val="en-IN"/>
               </w:rPr>
-              <w:t xml:space="preserve">Python (work experience), C++ (data structures &amp; algorithms), </w:t>
+              <w:t>Swift (internship)</w:t>
             </w:r>
             <w:r>
               <w:rPr>
                 <w:rFonts w:ascii="Calibri" w:hAnsi="Calibri" w:cs="Calibri"/>
                 <w:lang w:val="en-IN"/>
               </w:rPr>
+              <w:t xml:space="preserve">, </w:t>
+            </w:r>
+            <w:bookmarkStart w:id="14" w:name="_Hlk164984571"/>
+            <w:r>
+              <w:rPr>
+                <w:rFonts w:ascii="Calibri" w:hAnsi="Calibri" w:cs="Calibri"/>
+                <w:lang w:val="en-IN"/>
+              </w:rPr>
               <w:t xml:space="preserve">and </w:t>
             </w:r>
             <w:r>
@@ -2471,8 +2488,9 @@
                 <w:rFonts w:ascii="Calibri" w:hAnsi="Calibri" w:cs="Calibri"/>
                 <w:lang w:val="en-IN"/>
               </w:rPr>
-              <w:t>Swift (internship)</w:t>
-            </w:r>
+              <w:t>Core Java</w:t>
+            </w:r>
+            <w:bookmarkEnd w:id="14"/>
             <w:r>
               <w:rPr>
                 <w:rFonts w:ascii="Calibri" w:hAnsi="Calibri" w:cs="Calibri"/>
@@ -2679,6 +2697,7 @@
               <w:t>.</w:t>
             </w:r>
           </w:p>
+          <w:bookmarkEnd w:id="13"/>
           <w:p>
             <w:pPr>
               <w:pStyle w:val="Achievement"/>
@@ -2938,7 +2957,7 @@
                 <w:szCs w:val="20"/>
               </w:rPr>
             </w:pPr>
-            <w:bookmarkStart w:id="13" w:name="_Hlk158942803"/>
+            <w:bookmarkStart w:id="15" w:name="_Hlk158942803"/>
             <w:r>
               <w:rPr>
                 <w:rFonts w:ascii="Calibri" w:hAnsi="Calibri" w:cs="Calibri"/>
@@ -3062,7 +3081,7 @@
               </w:rPr>
               <w:t>.</w:t>
             </w:r>
-            <w:bookmarkEnd w:id="13"/>
+            <w:bookmarkEnd w:id="15"/>
           </w:p>
           <w:p>
             <w:pPr>

</xml_diff>